<commit_message>
Learned about LLM ,RAG Why Rag came into picture, drawbacks of LLM's
</commit_message>
<xml_diff>
--- a/Machine_learning/ML_Notes.docx
+++ b/Machine_learning/ML_Notes.docx
@@ -6,55 +6,50 @@
       <w:pPr>
         <w:shd w:val="clear" w:color="auto" w:fill="2E74B5" w:themeFill="accent5" w:themeFillShade="BF"/>
         <w:rPr>
-          <w:b/>
-          <w:bCs/>
           <w:i/>
           <w:iCs/>
-          <w:sz w:val="52"/>
-          <w:szCs w:val="52"/>
+          <w:sz w:val="36"/>
+          <w:szCs w:val="36"/>
+          <w:highlight w:val="yellow"/>
           <w:u w:val="single"/>
         </w:rPr>
       </w:pPr>
       <w:r>
         <w:rPr>
-          <w:b/>
-          <w:bCs/>
           <w:i/>
           <w:iCs/>
-          <w:sz w:val="52"/>
-          <w:szCs w:val="52"/>
+          <w:sz w:val="36"/>
+          <w:szCs w:val="36"/>
+          <w:highlight w:val="yellow"/>
           <w:u w:val="single"/>
         </w:rPr>
-        <w:t>S</w:t>
-      </w:r>
-      <w:r>
-        <w:rPr>
-          <w:b/>
-          <w:bCs/>
-          <w:i/>
-          <w:iCs/>
-          <w:sz w:val="52"/>
-          <w:szCs w:val="52"/>
-          <w:u w:val="single"/>
-        </w:rPr>
-        <w:t>tructure</w:t>
-      </w:r>
-      <w:r>
-        <w:rPr>
-          <w:b/>
-          <w:bCs/>
-          <w:i/>
-          <w:iCs/>
-          <w:sz w:val="52"/>
-          <w:szCs w:val="52"/>
-          <w:u w:val="single"/>
-        </w:rPr>
-        <w:t>:-</w:t>
-      </w:r>
-    </w:p>
-    <w:p/>
-    <w:p>
-      <w:r>
+        <w:t>Structure:-</w:t>
+      </w:r>
+    </w:p>
+    <w:p>
+      <w:pPr>
+        <w:rPr>
+          <w:sz w:val="36"/>
+          <w:szCs w:val="36"/>
+          <w:highlight w:val="yellow"/>
+        </w:rPr>
+      </w:pPr>
+    </w:p>
+    <w:p>
+      <w:pPr>
+        <w:rPr>
+          <w:sz w:val="36"/>
+          <w:szCs w:val="36"/>
+          <w:highlight w:val="yellow"/>
+        </w:rPr>
+      </w:pPr>
+      <w:r>
+        <w:rPr>
+          <w:noProof/>
+          <w:sz w:val="36"/>
+          <w:szCs w:val="36"/>
+          <w:highlight w:val="yellow"/>
+        </w:rPr>
         <w:drawing>
           <wp:inline distT="0" distB="0" distL="0" distR="0" wp14:anchorId="1FA1BF9C" wp14:editId="417649BB">
             <wp:extent cx="5731510" cy="5762625"/>
@@ -73,7 +68,7 @@
                     </pic:cNvPicPr>
                   </pic:nvPicPr>
                   <pic:blipFill>
-                    <a:blip r:embed="rId6">
+                    <a:blip r:embed="rId7">
                       <a:extLst>
                         <a:ext uri="{28A0092B-C50C-407E-A947-70E740481C1C}">
                           <a14:useLocalDpi xmlns:a14="http://schemas.microsoft.com/office/drawing/2010/main" val="0"/>
@@ -105,7 +100,1150 @@
         </w:drawing>
       </w:r>
     </w:p>
-    <w:p/>
+    <w:p>
+      <w:pPr>
+        <w:rPr>
+          <w:sz w:val="36"/>
+          <w:szCs w:val="36"/>
+          <w:highlight w:val="yellow"/>
+        </w:rPr>
+      </w:pPr>
+    </w:p>
+    <w:p>
+      <w:pPr>
+        <w:rPr>
+          <w:sz w:val="36"/>
+          <w:szCs w:val="36"/>
+        </w:rPr>
+      </w:pPr>
+      <w:r>
+        <w:rPr>
+          <w:sz w:val="36"/>
+          <w:szCs w:val="36"/>
+          <w:highlight w:val="yellow"/>
+        </w:rPr>
+        <w:br w:type="page"/>
+      </w:r>
+      <w:r>
+        <w:rPr>
+          <w:sz w:val="36"/>
+          <w:szCs w:val="36"/>
+          <w:highlight w:val="yellow"/>
+        </w:rPr>
+        <w:lastRenderedPageBreak/>
+        <w:t>What Is Machine learning ?</w:t>
+      </w:r>
+    </w:p>
+    <w:p>
+      <w:pPr>
+        <w:pStyle w:val="ListParagraph"/>
+        <w:numPr>
+          <w:ilvl w:val="0"/>
+          <w:numId w:val="1"/>
+        </w:numPr>
+        <w:rPr>
+          <w:sz w:val="36"/>
+          <w:szCs w:val="36"/>
+        </w:rPr>
+      </w:pPr>
+      <w:r>
+        <w:rPr>
+          <w:sz w:val="36"/>
+          <w:szCs w:val="36"/>
+        </w:rPr>
+        <w:t xml:space="preserve"> ML is Subset of AI</w:t>
+      </w:r>
+    </w:p>
+    <w:p>
+      <w:pPr>
+        <w:pStyle w:val="ListParagraph"/>
+        <w:numPr>
+          <w:ilvl w:val="0"/>
+          <w:numId w:val="1"/>
+        </w:numPr>
+        <w:rPr>
+          <w:sz w:val="36"/>
+          <w:szCs w:val="36"/>
+        </w:rPr>
+      </w:pPr>
+      <w:r>
+        <w:rPr>
+          <w:sz w:val="36"/>
+          <w:szCs w:val="36"/>
+        </w:rPr>
+        <w:t>Focused on letting Computers learn from data without being explicitly programmed.</w:t>
+      </w:r>
+    </w:p>
+    <w:p>
+      <w:pPr>
+        <w:pStyle w:val="ListParagraph"/>
+        <w:rPr>
+          <w:sz w:val="36"/>
+          <w:szCs w:val="36"/>
+        </w:rPr>
+      </w:pPr>
+    </w:p>
+    <w:p>
+      <w:pPr>
+        <w:pStyle w:val="ListParagraph"/>
+        <w:pBdr>
+          <w:bottom w:val="single" w:sz="6" w:space="1" w:color="auto"/>
+        </w:pBdr>
+        <w:ind w:left="0"/>
+        <w:rPr>
+          <w:sz w:val="36"/>
+          <w:szCs w:val="36"/>
+        </w:rPr>
+      </w:pPr>
+      <w:r>
+        <w:rPr>
+          <w:sz w:val="36"/>
+          <w:szCs w:val="36"/>
+          <w:shd w:val="clear" w:color="auto" w:fill="C5E0B3" w:themeFill="accent6" w:themeFillTint="66"/>
+        </w:rPr>
+        <w:t xml:space="preserve">Machine Learning is a way of making computers </w:t>
+      </w:r>
+      <w:r>
+        <w:rPr>
+          <w:color w:val="EE0000"/>
+          <w:sz w:val="36"/>
+          <w:szCs w:val="36"/>
+          <w:shd w:val="clear" w:color="auto" w:fill="C5E0B3" w:themeFill="accent6" w:themeFillTint="66"/>
+        </w:rPr>
+        <w:t xml:space="preserve">learn patterns from data </w:t>
+      </w:r>
+      <w:r>
+        <w:rPr>
+          <w:sz w:val="36"/>
+          <w:szCs w:val="36"/>
+          <w:shd w:val="clear" w:color="auto" w:fill="C5E0B3" w:themeFill="accent6" w:themeFillTint="66"/>
+        </w:rPr>
+        <w:t xml:space="preserve">so they can make </w:t>
+      </w:r>
+      <w:r>
+        <w:rPr>
+          <w:color w:val="00B0F0"/>
+          <w:sz w:val="36"/>
+          <w:szCs w:val="36"/>
+          <w:shd w:val="clear" w:color="auto" w:fill="C5E0B3" w:themeFill="accent6" w:themeFillTint="66"/>
+        </w:rPr>
+        <w:t>predictions</w:t>
+      </w:r>
+      <w:r>
+        <w:rPr>
+          <w:sz w:val="36"/>
+          <w:szCs w:val="36"/>
+          <w:shd w:val="clear" w:color="auto" w:fill="C5E0B3" w:themeFill="accent6" w:themeFillTint="66"/>
+        </w:rPr>
+        <w:t xml:space="preserve"> or </w:t>
+      </w:r>
+      <w:r>
+        <w:rPr>
+          <w:color w:val="00B0F0"/>
+          <w:sz w:val="36"/>
+          <w:szCs w:val="36"/>
+          <w:shd w:val="clear" w:color="auto" w:fill="C5E0B3" w:themeFill="accent6" w:themeFillTint="66"/>
+        </w:rPr>
+        <w:t xml:space="preserve">decisions </w:t>
+      </w:r>
+      <w:r>
+        <w:rPr>
+          <w:sz w:val="36"/>
+          <w:szCs w:val="36"/>
+          <w:shd w:val="clear" w:color="auto" w:fill="C5E0B3" w:themeFill="accent6" w:themeFillTint="66"/>
+        </w:rPr>
+        <w:t>without us explicitly programming every rule</w:t>
+      </w:r>
+      <w:r>
+        <w:rPr>
+          <w:sz w:val="36"/>
+          <w:szCs w:val="36"/>
+        </w:rPr>
+        <w:t>.</w:t>
+      </w:r>
+    </w:p>
+    <w:p>
+      <w:pPr>
+        <w:pStyle w:val="ListParagraph"/>
+        <w:ind w:left="0"/>
+        <w:rPr>
+          <w:sz w:val="36"/>
+          <w:szCs w:val="36"/>
+        </w:rPr>
+      </w:pPr>
+    </w:p>
+    <w:p>
+      <w:pPr>
+        <w:rPr>
+          <w:sz w:val="36"/>
+          <w:szCs w:val="36"/>
+        </w:rPr>
+      </w:pPr>
+    </w:p>
+    <w:p>
+      <w:pPr>
+        <w:rPr>
+          <w:sz w:val="36"/>
+          <w:szCs w:val="36"/>
+        </w:rPr>
+      </w:pPr>
+      <w:r>
+        <w:rPr>
+          <w:sz w:val="36"/>
+          <w:szCs w:val="36"/>
+          <w:highlight w:val="yellow"/>
+        </w:rPr>
+        <w:t>Why ML CAME:- ?</w:t>
+      </w:r>
+    </w:p>
+    <w:p>
+      <w:pPr>
+        <w:rPr>
+          <w:color w:val="C45911" w:themeColor="accent2" w:themeShade="BF"/>
+          <w:sz w:val="36"/>
+          <w:szCs w:val="36"/>
+        </w:rPr>
+      </w:pPr>
+      <w:r>
+        <w:rPr>
+          <w:color w:val="C45911" w:themeColor="accent2" w:themeShade="BF"/>
+          <w:sz w:val="36"/>
+          <w:szCs w:val="36"/>
+        </w:rPr>
+        <w:t>Imagine you want to create a program that detects whether an email is spam.</w:t>
+      </w:r>
+    </w:p>
+    <w:p>
+      <w:pPr>
+        <w:rPr>
+          <w:color w:val="C45911" w:themeColor="accent2" w:themeShade="BF"/>
+          <w:sz w:val="36"/>
+          <w:szCs w:val="36"/>
+        </w:rPr>
+      </w:pPr>
+      <w:r>
+        <w:rPr>
+          <w:color w:val="C45911" w:themeColor="accent2" w:themeShade="BF"/>
+          <w:sz w:val="36"/>
+          <w:szCs w:val="36"/>
+        </w:rPr>
+        <w:t>Traditional programming</w:t>
+      </w:r>
+    </w:p>
+    <w:p>
+      <w:pPr>
+        <w:rPr>
+          <w:color w:val="C45911" w:themeColor="accent2" w:themeShade="BF"/>
+          <w:sz w:val="36"/>
+          <w:szCs w:val="36"/>
+        </w:rPr>
+      </w:pPr>
+      <w:r>
+        <w:rPr>
+          <w:color w:val="C45911" w:themeColor="accent2" w:themeShade="BF"/>
+          <w:sz w:val="36"/>
+          <w:szCs w:val="36"/>
+        </w:rPr>
+        <w:t>You might write:</w:t>
+      </w:r>
+    </w:p>
+    <w:p>
+      <w:pPr>
+        <w:rPr>
+          <w:color w:val="C45911" w:themeColor="accent2" w:themeShade="BF"/>
+          <w:sz w:val="36"/>
+          <w:szCs w:val="36"/>
+        </w:rPr>
+      </w:pPr>
+      <w:r>
+        <w:rPr>
+          <w:color w:val="C45911" w:themeColor="accent2" w:themeShade="BF"/>
+          <w:sz w:val="36"/>
+          <w:szCs w:val="36"/>
+        </w:rPr>
+        <w:t>IF email contains "FREE MONEY"</w:t>
+      </w:r>
+    </w:p>
+    <w:p>
+      <w:pPr>
+        <w:rPr>
+          <w:color w:val="C45911" w:themeColor="accent2" w:themeShade="BF"/>
+          <w:sz w:val="36"/>
+          <w:szCs w:val="36"/>
+        </w:rPr>
+      </w:pPr>
+      <w:r>
+        <w:rPr>
+          <w:color w:val="C45911" w:themeColor="accent2" w:themeShade="BF"/>
+          <w:sz w:val="36"/>
+          <w:szCs w:val="36"/>
+        </w:rPr>
+        <w:t xml:space="preserve">    → SPAM</w:t>
+      </w:r>
+    </w:p>
+    <w:p>
+      <w:pPr>
+        <w:rPr>
+          <w:color w:val="C45911" w:themeColor="accent2" w:themeShade="BF"/>
+          <w:sz w:val="36"/>
+          <w:szCs w:val="36"/>
+        </w:rPr>
+      </w:pPr>
+    </w:p>
+    <w:p>
+      <w:pPr>
+        <w:rPr>
+          <w:color w:val="C45911" w:themeColor="accent2" w:themeShade="BF"/>
+          <w:sz w:val="36"/>
+          <w:szCs w:val="36"/>
+        </w:rPr>
+      </w:pPr>
+      <w:r>
+        <w:rPr>
+          <w:color w:val="C45911" w:themeColor="accent2" w:themeShade="BF"/>
+          <w:sz w:val="36"/>
+          <w:szCs w:val="36"/>
+        </w:rPr>
+        <w:t>IF email contains "WIN PRIZE"</w:t>
+      </w:r>
+    </w:p>
+    <w:p>
+      <w:pPr>
+        <w:rPr>
+          <w:color w:val="C45911" w:themeColor="accent2" w:themeShade="BF"/>
+          <w:sz w:val="36"/>
+          <w:szCs w:val="36"/>
+        </w:rPr>
+      </w:pPr>
+      <w:r>
+        <w:rPr>
+          <w:color w:val="C45911" w:themeColor="accent2" w:themeShade="BF"/>
+          <w:sz w:val="36"/>
+          <w:szCs w:val="36"/>
+        </w:rPr>
+        <w:t xml:space="preserve">    → SPAM</w:t>
+      </w:r>
+    </w:p>
+    <w:p>
+      <w:pPr>
+        <w:rPr>
+          <w:color w:val="C45911" w:themeColor="accent2" w:themeShade="BF"/>
+          <w:sz w:val="36"/>
+          <w:szCs w:val="36"/>
+        </w:rPr>
+      </w:pPr>
+    </w:p>
+    <w:p>
+      <w:pPr>
+        <w:rPr>
+          <w:color w:val="C45911" w:themeColor="accent2" w:themeShade="BF"/>
+          <w:sz w:val="36"/>
+          <w:szCs w:val="36"/>
+        </w:rPr>
+      </w:pPr>
+      <w:r>
+        <w:rPr>
+          <w:color w:val="C45911" w:themeColor="accent2" w:themeShade="BF"/>
+          <w:sz w:val="36"/>
+          <w:szCs w:val="36"/>
+        </w:rPr>
+        <w:t>IF email contains "CLICK HERE"</w:t>
+      </w:r>
+    </w:p>
+    <w:p>
+      <w:pPr>
+        <w:rPr>
+          <w:color w:val="C45911" w:themeColor="accent2" w:themeShade="BF"/>
+          <w:sz w:val="36"/>
+          <w:szCs w:val="36"/>
+        </w:rPr>
+      </w:pPr>
+      <w:r>
+        <w:rPr>
+          <w:color w:val="C45911" w:themeColor="accent2" w:themeShade="BF"/>
+          <w:sz w:val="36"/>
+          <w:szCs w:val="36"/>
+        </w:rPr>
+        <w:t xml:space="preserve">    → SPAM</w:t>
+      </w:r>
+    </w:p>
+    <w:p>
+      <w:pPr>
+        <w:rPr>
+          <w:color w:val="C45911" w:themeColor="accent2" w:themeShade="BF"/>
+          <w:sz w:val="36"/>
+          <w:szCs w:val="36"/>
+        </w:rPr>
+      </w:pPr>
+      <w:r>
+        <w:rPr>
+          <w:color w:val="C45911" w:themeColor="accent2" w:themeShade="BF"/>
+          <w:sz w:val="36"/>
+          <w:szCs w:val="36"/>
+        </w:rPr>
+        <w:t>But spam keeps changing.</w:t>
+      </w:r>
+    </w:p>
+    <w:p>
+      <w:pPr>
+        <w:rPr>
+          <w:sz w:val="36"/>
+          <w:szCs w:val="36"/>
+        </w:rPr>
+      </w:pPr>
+    </w:p>
+    <w:p>
+      <w:pPr>
+        <w:rPr>
+          <w:color w:val="C45911" w:themeColor="accent2" w:themeShade="BF"/>
+          <w:sz w:val="36"/>
+          <w:szCs w:val="36"/>
+        </w:rPr>
+      </w:pPr>
+      <w:r>
+        <w:rPr>
+          <w:color w:val="C45911" w:themeColor="accent2" w:themeShade="BF"/>
+          <w:sz w:val="36"/>
+          <w:szCs w:val="36"/>
+        </w:rPr>
+        <w:t>So instead of telling the computer every rule, we give it examples.</w:t>
+      </w:r>
+    </w:p>
+    <w:p>
+      <w:pPr>
+        <w:rPr>
+          <w:color w:val="C45911" w:themeColor="accent2" w:themeShade="BF"/>
+          <w:sz w:val="36"/>
+          <w:szCs w:val="36"/>
+        </w:rPr>
+      </w:pPr>
+      <w:r>
+        <w:rPr>
+          <w:color w:val="C45911" w:themeColor="accent2" w:themeShade="BF"/>
+          <w:sz w:val="36"/>
+          <w:szCs w:val="36"/>
+        </w:rPr>
+        <w:t>Email                    Label</w:t>
+      </w:r>
+    </w:p>
+    <w:p>
+      <w:pPr>
+        <w:rPr>
+          <w:color w:val="C45911" w:themeColor="accent2" w:themeShade="BF"/>
+          <w:sz w:val="36"/>
+          <w:szCs w:val="36"/>
+        </w:rPr>
+      </w:pPr>
+    </w:p>
+    <w:p>
+      <w:pPr>
+        <w:rPr>
+          <w:color w:val="C45911" w:themeColor="accent2" w:themeShade="BF"/>
+          <w:sz w:val="36"/>
+          <w:szCs w:val="36"/>
+        </w:rPr>
+      </w:pPr>
+      <w:r>
+        <w:rPr>
+          <w:color w:val="C45911" w:themeColor="accent2" w:themeShade="BF"/>
+          <w:sz w:val="36"/>
+          <w:szCs w:val="36"/>
+        </w:rPr>
+        <w:t>"Win free money!"         Spam</w:t>
+      </w:r>
+    </w:p>
+    <w:p>
+      <w:pPr>
+        <w:rPr>
+          <w:color w:val="C45911" w:themeColor="accent2" w:themeShade="BF"/>
+          <w:sz w:val="36"/>
+          <w:szCs w:val="36"/>
+        </w:rPr>
+      </w:pPr>
+      <w:r>
+        <w:rPr>
+          <w:color w:val="C45911" w:themeColor="accent2" w:themeShade="BF"/>
+          <w:sz w:val="36"/>
+          <w:szCs w:val="36"/>
+        </w:rPr>
+        <w:t>"Meeting at 3 PM"         Not Spam</w:t>
+      </w:r>
+    </w:p>
+    <w:p>
+      <w:pPr>
+        <w:rPr>
+          <w:color w:val="C45911" w:themeColor="accent2" w:themeShade="BF"/>
+          <w:sz w:val="36"/>
+          <w:szCs w:val="36"/>
+        </w:rPr>
+      </w:pPr>
+      <w:r>
+        <w:rPr>
+          <w:color w:val="C45911" w:themeColor="accent2" w:themeShade="BF"/>
+          <w:sz w:val="36"/>
+          <w:szCs w:val="36"/>
+        </w:rPr>
+        <w:t>"You won a prize!"        Spam</w:t>
+      </w:r>
+    </w:p>
+    <w:p>
+      <w:pPr>
+        <w:rPr>
+          <w:color w:val="C45911" w:themeColor="accent2" w:themeShade="BF"/>
+          <w:sz w:val="36"/>
+          <w:szCs w:val="36"/>
+        </w:rPr>
+      </w:pPr>
+      <w:r>
+        <w:rPr>
+          <w:color w:val="C45911" w:themeColor="accent2" w:themeShade="BF"/>
+          <w:sz w:val="36"/>
+          <w:szCs w:val="36"/>
+        </w:rPr>
+        <w:t>"Project report attached" Not Spam</w:t>
+      </w:r>
+    </w:p>
+    <w:p>
+      <w:pPr>
+        <w:rPr>
+          <w:color w:val="C45911" w:themeColor="accent2" w:themeShade="BF"/>
+          <w:sz w:val="36"/>
+          <w:szCs w:val="36"/>
+        </w:rPr>
+      </w:pPr>
+      <w:r>
+        <w:rPr>
+          <w:color w:val="C45911" w:themeColor="accent2" w:themeShade="BF"/>
+          <w:sz w:val="36"/>
+          <w:szCs w:val="36"/>
+        </w:rPr>
+        <w:t>...</w:t>
+      </w:r>
+    </w:p>
+    <w:p>
+      <w:pPr>
+        <w:rPr>
+          <w:color w:val="C45911" w:themeColor="accent2" w:themeShade="BF"/>
+          <w:sz w:val="36"/>
+          <w:szCs w:val="36"/>
+        </w:rPr>
+      </w:pPr>
+      <w:r>
+        <w:rPr>
+          <w:color w:val="C45911" w:themeColor="accent2" w:themeShade="BF"/>
+          <w:sz w:val="36"/>
+          <w:szCs w:val="36"/>
+        </w:rPr>
+        <w:t>The machine learns patterns.</w:t>
+      </w:r>
+    </w:p>
+    <w:p>
+      <w:pPr>
+        <w:rPr>
+          <w:color w:val="C45911" w:themeColor="accent2" w:themeShade="BF"/>
+          <w:sz w:val="36"/>
+          <w:szCs w:val="36"/>
+        </w:rPr>
+      </w:pPr>
+      <w:r>
+        <w:rPr>
+          <w:color w:val="C45911" w:themeColor="accent2" w:themeShade="BF"/>
+          <w:sz w:val="36"/>
+          <w:szCs w:val="36"/>
+        </w:rPr>
+        <w:t>Then:</w:t>
+      </w:r>
+    </w:p>
+    <w:p>
+      <w:pPr>
+        <w:rPr>
+          <w:color w:val="C45911" w:themeColor="accent2" w:themeShade="BF"/>
+          <w:sz w:val="36"/>
+          <w:szCs w:val="36"/>
+        </w:rPr>
+      </w:pPr>
+      <w:r>
+        <w:rPr>
+          <w:color w:val="C45911" w:themeColor="accent2" w:themeShade="BF"/>
+          <w:sz w:val="36"/>
+          <w:szCs w:val="36"/>
+        </w:rPr>
+        <w:t>New email</w:t>
+      </w:r>
+    </w:p>
+    <w:p>
+      <w:pPr>
+        <w:rPr>
+          <w:color w:val="C45911" w:themeColor="accent2" w:themeShade="BF"/>
+          <w:sz w:val="36"/>
+          <w:szCs w:val="36"/>
+        </w:rPr>
+      </w:pPr>
+      <w:r>
+        <w:rPr>
+          <w:color w:val="C45911" w:themeColor="accent2" w:themeShade="BF"/>
+          <w:sz w:val="36"/>
+          <w:szCs w:val="36"/>
+        </w:rPr>
+        <w:t xml:space="preserve">   ↓</w:t>
+      </w:r>
+    </w:p>
+    <w:p>
+      <w:pPr>
+        <w:rPr>
+          <w:color w:val="C45911" w:themeColor="accent2" w:themeShade="BF"/>
+          <w:sz w:val="36"/>
+          <w:szCs w:val="36"/>
+        </w:rPr>
+      </w:pPr>
+      <w:r>
+        <w:rPr>
+          <w:color w:val="C45911" w:themeColor="accent2" w:themeShade="BF"/>
+          <w:sz w:val="36"/>
+          <w:szCs w:val="36"/>
+        </w:rPr>
+        <w:t>ML model</w:t>
+      </w:r>
+    </w:p>
+    <w:p>
+      <w:pPr>
+        <w:rPr>
+          <w:color w:val="C45911" w:themeColor="accent2" w:themeShade="BF"/>
+          <w:sz w:val="36"/>
+          <w:szCs w:val="36"/>
+        </w:rPr>
+      </w:pPr>
+      <w:r>
+        <w:rPr>
+          <w:color w:val="C45911" w:themeColor="accent2" w:themeShade="BF"/>
+          <w:sz w:val="36"/>
+          <w:szCs w:val="36"/>
+        </w:rPr>
+        <w:t xml:space="preserve">   ↓</w:t>
+      </w:r>
+    </w:p>
+    <w:p>
+      <w:pPr>
+        <w:rPr>
+          <w:color w:val="C45911" w:themeColor="accent2" w:themeShade="BF"/>
+          <w:sz w:val="36"/>
+          <w:szCs w:val="36"/>
+        </w:rPr>
+      </w:pPr>
+      <w:r>
+        <w:rPr>
+          <w:color w:val="C45911" w:themeColor="accent2" w:themeShade="BF"/>
+          <w:sz w:val="36"/>
+          <w:szCs w:val="36"/>
+        </w:rPr>
+        <w:t>Spam / Not Spam</w:t>
+      </w:r>
+    </w:p>
+    <w:p>
+      <w:pPr>
+        <w:rPr>
+          <w:color w:val="C45911" w:themeColor="accent2" w:themeShade="BF"/>
+          <w:sz w:val="36"/>
+          <w:szCs w:val="36"/>
+        </w:rPr>
+      </w:pPr>
+      <w:r>
+        <w:rPr>
+          <w:color w:val="C45911" w:themeColor="accent2" w:themeShade="BF"/>
+          <w:sz w:val="36"/>
+          <w:szCs w:val="36"/>
+        </w:rPr>
+        <w:t>That's the fundamental idea of ML.</w:t>
+      </w:r>
+    </w:p>
+    <w:p>
+      <w:pPr>
+        <w:pBdr>
+          <w:top w:val="single" w:sz="6" w:space="1" w:color="auto"/>
+          <w:bottom w:val="single" w:sz="6" w:space="1" w:color="auto"/>
+        </w:pBdr>
+        <w:rPr>
+          <w:color w:val="C45911" w:themeColor="accent2" w:themeShade="BF"/>
+          <w:sz w:val="36"/>
+          <w:szCs w:val="36"/>
+        </w:rPr>
+      </w:pPr>
+    </w:p>
+    <w:p>
+      <w:pPr>
+        <w:rPr>
+          <w:sz w:val="36"/>
+          <w:szCs w:val="36"/>
+        </w:rPr>
+      </w:pPr>
+    </w:p>
+    <w:p>
+      <w:pPr>
+        <w:rPr>
+          <w:sz w:val="36"/>
+          <w:szCs w:val="36"/>
+        </w:rPr>
+      </w:pPr>
+    </w:p>
+    <w:p>
+      <w:pPr>
+        <w:rPr>
+          <w:sz w:val="36"/>
+          <w:szCs w:val="36"/>
+        </w:rPr>
+      </w:pPr>
+    </w:p>
+    <w:p>
+      <w:pPr>
+        <w:rPr>
+          <w:sz w:val="36"/>
+          <w:szCs w:val="36"/>
+        </w:rPr>
+      </w:pPr>
+      <w:r>
+        <w:rPr>
+          <w:sz w:val="36"/>
+          <w:szCs w:val="36"/>
+        </w:rPr>
+        <w:lastRenderedPageBreak/>
+        <w:t>TYPES( CLASSIFICATION OF ML ):-</w:t>
+      </w:r>
+    </w:p>
+    <w:p>
+      <w:pPr>
+        <w:rPr>
+          <w:sz w:val="36"/>
+          <w:szCs w:val="36"/>
+        </w:rPr>
+      </w:pPr>
+    </w:p>
+    <w:p>
+      <w:pPr>
+        <w:ind w:left="1440" w:firstLine="720"/>
+        <w:rPr>
+          <w:sz w:val="36"/>
+          <w:szCs w:val="36"/>
+        </w:rPr>
+      </w:pPr>
+      <w:r>
+        <w:rPr>
+          <w:noProof/>
+          <w:sz w:val="36"/>
+          <w:szCs w:val="36"/>
+        </w:rPr>
+        <mc:AlternateContent>
+          <mc:Choice Requires="wps">
+            <w:drawing>
+              <wp:anchor distT="0" distB="0" distL="114300" distR="114300" simplePos="0" relativeHeight="251665408" behindDoc="0" locked="0" layoutInCell="1" allowOverlap="1" wp14:anchorId="0070D1DB" wp14:editId="483AA9DC">
+                <wp:simplePos x="0" y="0"/>
+                <wp:positionH relativeFrom="column">
+                  <wp:posOffset>3406140</wp:posOffset>
+                </wp:positionH>
+                <wp:positionV relativeFrom="paragraph">
+                  <wp:posOffset>383540</wp:posOffset>
+                </wp:positionV>
+                <wp:extent cx="1356360" cy="1066800"/>
+                <wp:effectExtent l="0" t="0" r="72390" b="57150"/>
+                <wp:wrapNone/>
+                <wp:docPr id="1158130120" name="Straight Arrow Connector 1"/>
+                <wp:cNvGraphicFramePr/>
+                <a:graphic xmlns:a="http://schemas.openxmlformats.org/drawingml/2006/main">
+                  <a:graphicData uri="http://schemas.microsoft.com/office/word/2010/wordprocessingShape">
+                    <wps:wsp>
+                      <wps:cNvCnPr/>
+                      <wps:spPr>
+                        <a:xfrm>
+                          <a:off x="0" y="0"/>
+                          <a:ext cx="1356360" cy="1066800"/>
+                        </a:xfrm>
+                        <a:prstGeom prst="straightConnector1">
+                          <a:avLst/>
+                        </a:prstGeom>
+                        <a:ln>
+                          <a:tailEnd type="triangle"/>
+                        </a:ln>
+                      </wps:spPr>
+                      <wps:style>
+                        <a:lnRef idx="3">
+                          <a:schemeClr val="accent2"/>
+                        </a:lnRef>
+                        <a:fillRef idx="0">
+                          <a:schemeClr val="accent2"/>
+                        </a:fillRef>
+                        <a:effectRef idx="2">
+                          <a:schemeClr val="accent2"/>
+                        </a:effectRef>
+                        <a:fontRef idx="minor">
+                          <a:schemeClr val="tx1"/>
+                        </a:fontRef>
+                      </wps:style>
+                      <wps:bodyPr/>
+                    </wps:wsp>
+                  </a:graphicData>
+                </a:graphic>
+                <wp14:sizeRelH relativeFrom="margin">
+                  <wp14:pctWidth>0</wp14:pctWidth>
+                </wp14:sizeRelH>
+                <wp14:sizeRelV relativeFrom="margin">
+                  <wp14:pctHeight>0</wp14:pctHeight>
+                </wp14:sizeRelV>
+              </wp:anchor>
+            </w:drawing>
+          </mc:Choice>
+          <mc:Fallback>
+            <w:pict>
+              <v:shapetype w14:anchorId="6980D114" id="_x0000_t32" coordsize="21600,21600" o:spt="32" o:oned="t" path="m,l21600,21600e" filled="f">
+                <v:path arrowok="t" fillok="f" o:connecttype="none"/>
+                <o:lock v:ext="edit" shapetype="t"/>
+              </v:shapetype>
+              <v:shape id="Straight Arrow Connector 1" o:spid="_x0000_s1026" type="#_x0000_t32" style="position:absolute;margin-left:268.2pt;margin-top:30.2pt;width:106.8pt;height:84pt;z-index:251665408;visibility:visible;mso-wrap-style:square;mso-width-percent:0;mso-height-percent:0;mso-wrap-distance-left:9pt;mso-wrap-distance-top:0;mso-wrap-distance-right:9pt;mso-wrap-distance-bottom:0;mso-position-horizontal:absolute;mso-position-horizontal-relative:text;mso-position-vertical:absolute;mso-position-vertical-relative:text;mso-width-percent:0;mso-height-percent:0;mso-width-relative:margin;mso-height-relative:margin" o:gfxdata="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" strokecolor="#ed7d31 [3205]" strokeweight="1.5pt">
+                <v:stroke endarrow="block" joinstyle="miter"/>
+              </v:shape>
+            </w:pict>
+          </mc:Fallback>
+        </mc:AlternateContent>
+      </w:r>
+      <w:r>
+        <w:rPr>
+          <w:sz w:val="36"/>
+          <w:szCs w:val="36"/>
+        </w:rPr>
+        <w:t>MACHINE LEARNING</w:t>
+      </w:r>
+    </w:p>
+    <w:p>
+      <w:pPr>
+        <w:rPr>
+          <w:sz w:val="56"/>
+          <w:szCs w:val="56"/>
+        </w:rPr>
+      </w:pPr>
+      <w:r>
+        <w:rPr>
+          <w:noProof/>
+          <w:sz w:val="56"/>
+          <w:szCs w:val="56"/>
+        </w:rPr>
+        <mc:AlternateContent>
+          <mc:Choice Requires="wps">
+            <w:drawing>
+              <wp:anchor distT="0" distB="0" distL="114300" distR="114300" simplePos="0" relativeHeight="251666432" behindDoc="0" locked="0" layoutInCell="1" allowOverlap="1" wp14:anchorId="39A5C1B2" wp14:editId="42AE6AFD">
+                <wp:simplePos x="0" y="0"/>
+                <wp:positionH relativeFrom="column">
+                  <wp:posOffset>-19685</wp:posOffset>
+                </wp:positionH>
+                <wp:positionV relativeFrom="paragraph">
+                  <wp:posOffset>2472055</wp:posOffset>
+                </wp:positionV>
+                <wp:extent cx="697230" cy="1579880"/>
+                <wp:effectExtent l="19050" t="0" r="45720" b="39370"/>
+                <wp:wrapNone/>
+                <wp:docPr id="1442641638" name="Arrow: Down 2"/>
+                <wp:cNvGraphicFramePr/>
+                <a:graphic xmlns:a="http://schemas.openxmlformats.org/drawingml/2006/main">
+                  <a:graphicData uri="http://schemas.microsoft.com/office/word/2010/wordprocessingShape">
+                    <wps:wsp>
+                      <wps:cNvSpPr/>
+                      <wps:spPr>
+                        <a:xfrm flipH="1">
+                          <a:off x="0" y="0"/>
+                          <a:ext cx="697230" cy="1579880"/>
+                        </a:xfrm>
+                        <a:prstGeom prst="downArrow">
+                          <a:avLst/>
+                        </a:prstGeom>
+                      </wps:spPr>
+                      <wps:style>
+                        <a:lnRef idx="2">
+                          <a:schemeClr val="accent1">
+                            <a:shade val="15000"/>
+                          </a:schemeClr>
+                        </a:lnRef>
+                        <a:fillRef idx="1">
+                          <a:schemeClr val="accent1"/>
+                        </a:fillRef>
+                        <a:effectRef idx="0">
+                          <a:schemeClr val="accent1"/>
+                        </a:effectRef>
+                        <a:fontRef idx="minor">
+                          <a:schemeClr val="lt1"/>
+                        </a:fontRef>
+                      </wps:style>
+                      <wps:bodyPr rot="0" spcFirstLastPara="0" vertOverflow="overflow" horzOverflow="overflow" vert="horz" wrap="square" lIns="91440" tIns="45720" rIns="91440" bIns="45720" numCol="1" spcCol="0" rtlCol="0" fromWordArt="0" anchor="ctr" anchorCtr="0" forceAA="0" compatLnSpc="1">
+                        <a:prstTxWarp prst="textNoShape">
+                          <a:avLst/>
+                        </a:prstTxWarp>
+                        <a:noAutofit/>
+                      </wps:bodyPr>
+                    </wps:wsp>
+                  </a:graphicData>
+                </a:graphic>
+                <wp14:sizeRelH relativeFrom="margin">
+                  <wp14:pctWidth>0</wp14:pctWidth>
+                </wp14:sizeRelH>
+                <wp14:sizeRelV relativeFrom="margin">
+                  <wp14:pctHeight>0</wp14:pctHeight>
+                </wp14:sizeRelV>
+              </wp:anchor>
+            </w:drawing>
+          </mc:Choice>
+          <mc:Fallback>
+            <w:pict>
+              <v:shapetype w14:anchorId="225D442E" id="_x0000_t67" coordsize="21600,21600" o:spt="67" adj="16200,5400" path="m0@0l@1@0@1,0@2,0@2@0,21600@0,10800,21600xe">
+                <v:stroke joinstyle="miter"/>
+                <v:formulas>
+                  <v:f eqn="val #0"/>
+                  <v:f eqn="val #1"/>
+                  <v:f eqn="sum height 0 #1"/>
+                  <v:f eqn="sum 10800 0 #1"/>
+                  <v:f eqn="sum width 0 #0"/>
+                  <v:f eqn="prod @4 @3 10800"/>
+                  <v:f eqn="sum width 0 @5"/>
+                </v:formulas>
+                <v:path o:connecttype="custom" o:connectlocs="10800,0;0,@0;10800,21600;21600,@0" o:connectangles="270,180,90,0" textboxrect="@1,0,@2,@6"/>
+                <v:handles>
+                  <v:h position="#1,#0" xrange="0,10800" yrange="0,21600"/>
+                </v:handles>
+              </v:shapetype>
+              <v:shape id="Arrow: Down 2" o:spid="_x0000_s1026" type="#_x0000_t67" style="position:absolute;margin-left:-1.55pt;margin-top:194.65pt;width:54.9pt;height:124.4pt;flip:x;z-index:251666432;visibility:visible;mso-wrap-style:square;mso-width-percent:0;mso-height-percent:0;mso-wrap-distance-left:9pt;mso-wrap-distance-top:0;mso-wrap-distance-right:9pt;mso-wrap-distance-bottom:0;mso-position-horizontal:absolute;mso-position-horizontal-relative:text;mso-position-vertical:absolute;mso-position-vertical-relative:text;mso-width-percent:0;mso-height-percent:0;mso-width-relative:margin;mso-height-relative:margin;v-text-anchor:middle" o:gfxdata="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" adj="16834" fillcolor="#4472c4 [3204]" strokecolor="#09101d [484]" strokeweight="1pt"/>
+            </w:pict>
+          </mc:Fallback>
+        </mc:AlternateContent>
+      </w:r>
+      <w:r>
+        <w:rPr>
+          <w:noProof/>
+          <w:sz w:val="56"/>
+          <w:szCs w:val="56"/>
+        </w:rPr>
+        <mc:AlternateContent>
+          <mc:Choice Requires="wps">
+            <w:drawing>
+              <wp:anchor distT="0" distB="0" distL="114300" distR="114300" simplePos="0" relativeHeight="251663360" behindDoc="0" locked="0" layoutInCell="1" allowOverlap="1" wp14:anchorId="4CFEB0F8" wp14:editId="0DB507F3">
+                <wp:simplePos x="0" y="0"/>
+                <wp:positionH relativeFrom="column">
+                  <wp:posOffset>3115944</wp:posOffset>
+                </wp:positionH>
+                <wp:positionV relativeFrom="paragraph">
+                  <wp:posOffset>48895</wp:posOffset>
+                </wp:positionV>
+                <wp:extent cx="290195" cy="1485900"/>
+                <wp:effectExtent l="0" t="0" r="52705" b="57150"/>
+                <wp:wrapNone/>
+                <wp:docPr id="361739718" name="Straight Arrow Connector 1"/>
+                <wp:cNvGraphicFramePr/>
+                <a:graphic xmlns:a="http://schemas.openxmlformats.org/drawingml/2006/main">
+                  <a:graphicData uri="http://schemas.microsoft.com/office/word/2010/wordprocessingShape">
+                    <wps:wsp>
+                      <wps:cNvCnPr/>
+                      <wps:spPr>
+                        <a:xfrm>
+                          <a:off x="0" y="0"/>
+                          <a:ext cx="290195" cy="1485900"/>
+                        </a:xfrm>
+                        <a:prstGeom prst="straightConnector1">
+                          <a:avLst/>
+                        </a:prstGeom>
+                        <a:ln>
+                          <a:tailEnd type="triangle"/>
+                        </a:ln>
+                      </wps:spPr>
+                      <wps:style>
+                        <a:lnRef idx="3">
+                          <a:schemeClr val="accent2"/>
+                        </a:lnRef>
+                        <a:fillRef idx="0">
+                          <a:schemeClr val="accent2"/>
+                        </a:fillRef>
+                        <a:effectRef idx="2">
+                          <a:schemeClr val="accent2"/>
+                        </a:effectRef>
+                        <a:fontRef idx="minor">
+                          <a:schemeClr val="tx1"/>
+                        </a:fontRef>
+                      </wps:style>
+                      <wps:bodyPr/>
+                    </wps:wsp>
+                  </a:graphicData>
+                </a:graphic>
+                <wp14:sizeRelH relativeFrom="margin">
+                  <wp14:pctWidth>0</wp14:pctWidth>
+                </wp14:sizeRelH>
+                <wp14:sizeRelV relativeFrom="margin">
+                  <wp14:pctHeight>0</wp14:pctHeight>
+                </wp14:sizeRelV>
+              </wp:anchor>
+            </w:drawing>
+          </mc:Choice>
+          <mc:Fallback>
+            <w:pict>
+              <v:shape w14:anchorId="735FDDA4" id="Straight Arrow Connector 1" o:spid="_x0000_s1026" type="#_x0000_t32" style="position:absolute;margin-left:245.35pt;margin-top:3.85pt;width:22.85pt;height:117pt;z-index:251663360;visibility:visible;mso-wrap-style:square;mso-width-percent:0;mso-height-percent:0;mso-wrap-distance-left:9pt;mso-wrap-distance-top:0;mso-wrap-distance-right:9pt;mso-wrap-distance-bottom:0;mso-position-horizontal:absolute;mso-position-horizontal-relative:text;mso-position-vertical:absolute;mso-position-vertical-relative:text;mso-width-percent:0;mso-height-percent:0;mso-width-relative:margin;mso-height-relative:margin" o:gfxdata="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" strokecolor="#ed7d31 [3205]" strokeweight="1.5pt">
+                <v:stroke endarrow="block" joinstyle="miter"/>
+              </v:shape>
+            </w:pict>
+          </mc:Fallback>
+        </mc:AlternateContent>
+      </w:r>
+      <w:r>
+        <w:rPr>
+          <w:noProof/>
+          <w:sz w:val="56"/>
+          <w:szCs w:val="56"/>
+        </w:rPr>
+        <mc:AlternateContent>
+          <mc:Choice Requires="wps">
+            <w:drawing>
+              <wp:anchor distT="0" distB="0" distL="114300" distR="114300" simplePos="0" relativeHeight="251661312" behindDoc="0" locked="0" layoutInCell="1" allowOverlap="1" wp14:anchorId="1179B801" wp14:editId="79434F0C">
+                <wp:simplePos x="0" y="0"/>
+                <wp:positionH relativeFrom="column">
+                  <wp:posOffset>2095500</wp:posOffset>
+                </wp:positionH>
+                <wp:positionV relativeFrom="paragraph">
+                  <wp:posOffset>117475</wp:posOffset>
+                </wp:positionV>
+                <wp:extent cx="140970" cy="1524000"/>
+                <wp:effectExtent l="38100" t="0" r="30480" b="57150"/>
+                <wp:wrapNone/>
+                <wp:docPr id="66147672" name="Straight Arrow Connector 1"/>
+                <wp:cNvGraphicFramePr/>
+                <a:graphic xmlns:a="http://schemas.openxmlformats.org/drawingml/2006/main">
+                  <a:graphicData uri="http://schemas.microsoft.com/office/word/2010/wordprocessingShape">
+                    <wps:wsp>
+                      <wps:cNvCnPr/>
+                      <wps:spPr>
+                        <a:xfrm flipH="1">
+                          <a:off x="0" y="0"/>
+                          <a:ext cx="140970" cy="1524000"/>
+                        </a:xfrm>
+                        <a:prstGeom prst="straightConnector1">
+                          <a:avLst/>
+                        </a:prstGeom>
+                        <a:ln>
+                          <a:tailEnd type="triangle"/>
+                        </a:ln>
+                      </wps:spPr>
+                      <wps:style>
+                        <a:lnRef idx="3">
+                          <a:schemeClr val="accent2"/>
+                        </a:lnRef>
+                        <a:fillRef idx="0">
+                          <a:schemeClr val="accent2"/>
+                        </a:fillRef>
+                        <a:effectRef idx="2">
+                          <a:schemeClr val="accent2"/>
+                        </a:effectRef>
+                        <a:fontRef idx="minor">
+                          <a:schemeClr val="tx1"/>
+                        </a:fontRef>
+                      </wps:style>
+                      <wps:bodyPr/>
+                    </wps:wsp>
+                  </a:graphicData>
+                </a:graphic>
+                <wp14:sizeRelH relativeFrom="margin">
+                  <wp14:pctWidth>0</wp14:pctWidth>
+                </wp14:sizeRelH>
+                <wp14:sizeRelV relativeFrom="margin">
+                  <wp14:pctHeight>0</wp14:pctHeight>
+                </wp14:sizeRelV>
+              </wp:anchor>
+            </w:drawing>
+          </mc:Choice>
+          <mc:Fallback>
+            <w:pict>
+              <v:shape w14:anchorId="079E8B09" id="Straight Arrow Connector 1" o:spid="_x0000_s1026" type="#_x0000_t32" style="position:absolute;margin-left:165pt;margin-top:9.25pt;width:11.1pt;height:120pt;flip:x;z-index:251661312;visibility:visible;mso-wrap-style:square;mso-width-percent:0;mso-height-percent:0;mso-wrap-distance-left:9pt;mso-wrap-distance-top:0;mso-wrap-distance-right:9pt;mso-wrap-distance-bottom:0;mso-position-horizontal:absolute;mso-position-horizontal-relative:text;mso-position-vertical:absolute;mso-position-vertical-relative:text;mso-width-percent:0;mso-height-percent:0;mso-width-relative:margin;mso-height-relative:margin" o:gfxdata="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" strokecolor="#ed7d31 [3205]" strokeweight="1.5pt">
+                <v:stroke endarrow="block" joinstyle="miter"/>
+              </v:shape>
+            </w:pict>
+          </mc:Fallback>
+        </mc:AlternateContent>
+      </w:r>
+      <w:r>
+        <w:rPr>
+          <w:noProof/>
+          <w:sz w:val="56"/>
+          <w:szCs w:val="56"/>
+        </w:rPr>
+        <mc:AlternateContent>
+          <mc:Choice Requires="wps">
+            <w:drawing>
+              <wp:anchor distT="0" distB="0" distL="114300" distR="114300" simplePos="0" relativeHeight="251659264" behindDoc="0" locked="0" layoutInCell="1" allowOverlap="1" wp14:anchorId="1B80AC52" wp14:editId="2D544A88">
+                <wp:simplePos x="0" y="0"/>
+                <wp:positionH relativeFrom="column">
+                  <wp:posOffset>373380</wp:posOffset>
+                </wp:positionH>
+                <wp:positionV relativeFrom="paragraph">
+                  <wp:posOffset>48895</wp:posOffset>
+                </wp:positionV>
+                <wp:extent cx="998220" cy="1089660"/>
+                <wp:effectExtent l="57150" t="19050" r="68580" b="110490"/>
+                <wp:wrapNone/>
+                <wp:docPr id="856161173" name="Straight Arrow Connector 1"/>
+                <wp:cNvGraphicFramePr/>
+                <a:graphic xmlns:a="http://schemas.openxmlformats.org/drawingml/2006/main">
+                  <a:graphicData uri="http://schemas.microsoft.com/office/word/2010/wordprocessingShape">
+                    <wps:wsp>
+                      <wps:cNvCnPr/>
+                      <wps:spPr>
+                        <a:xfrm flipH="1">
+                          <a:off x="0" y="0"/>
+                          <a:ext cx="998220" cy="1089660"/>
+                        </a:xfrm>
+                        <a:prstGeom prst="straightConnector1">
+                          <a:avLst/>
+                        </a:prstGeom>
+                        <a:ln>
+                          <a:solidFill>
+                            <a:schemeClr val="accent2"/>
+                          </a:solidFill>
+                          <a:tailEnd type="triangle"/>
+                        </a:ln>
+                        <a:effectLst>
+                          <a:outerShdw blurRad="50800" dist="38100" dir="5400000" algn="t" rotWithShape="0">
+                            <a:prstClr val="black">
+                              <a:alpha val="40000"/>
+                            </a:prstClr>
+                          </a:outerShdw>
+                        </a:effectLst>
+                      </wps:spPr>
+                      <wps:style>
+                        <a:lnRef idx="3">
+                          <a:schemeClr val="accent2"/>
+                        </a:lnRef>
+                        <a:fillRef idx="0">
+                          <a:schemeClr val="accent2"/>
+                        </a:fillRef>
+                        <a:effectRef idx="2">
+                          <a:schemeClr val="accent2"/>
+                        </a:effectRef>
+                        <a:fontRef idx="minor">
+                          <a:schemeClr val="tx1"/>
+                        </a:fontRef>
+                      </wps:style>
+                      <wps:bodyPr/>
+                    </wps:wsp>
+                  </a:graphicData>
+                </a:graphic>
+                <wp14:sizeRelH relativeFrom="margin">
+                  <wp14:pctWidth>0</wp14:pctWidth>
+                </wp14:sizeRelH>
+                <wp14:sizeRelV relativeFrom="margin">
+                  <wp14:pctHeight>0</wp14:pctHeight>
+                </wp14:sizeRelV>
+              </wp:anchor>
+            </w:drawing>
+          </mc:Choice>
+          <mc:Fallback>
+            <w:pict>
+              <v:shape w14:anchorId="7A147663" id="Straight Arrow Connector 1" o:spid="_x0000_s1026" type="#_x0000_t32" style="position:absolute;margin-left:29.4pt;margin-top:3.85pt;width:78.6pt;height:85.8pt;flip:x;z-index:251659264;visibility:visible;mso-wrap-style:square;mso-width-percent:0;mso-height-percent:0;mso-wrap-distance-left:9pt;mso-wrap-distance-top:0;mso-wrap-distance-right:9pt;mso-wrap-distance-bottom:0;mso-position-horizontal:absolute;mso-position-horizontal-relative:text;mso-position-vertical:absolute;mso-position-vertical-relative:text;mso-width-percent:0;mso-height-percent:0;mso-width-relative:margin;mso-height-relative:margin" o:gfxdata="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" strokecolor="#ed7d31 [3205]" strokeweight="1.5pt">
+                <v:stroke endarrow="block" joinstyle="miter"/>
+                <v:shadow on="t" color="black" opacity="26214f" origin=",-.5" offset="0,3pt"/>
+              </v:shape>
+            </w:pict>
+          </mc:Fallback>
+        </mc:AlternateContent>
+      </w:r>
+    </w:p>
     <w:sectPr>
       <w:pgSz w:w="11906" w:h="16838"/>
       <w:pgMar w:top="1440" w:right="1440" w:bottom="1440" w:left="1440" w:header="708" w:footer="708" w:gutter="0"/>
@@ -164,6 +1302,219 @@
     </w:p>
   </w:footnote>
 </w:footnotes>
+</file>
+
+<file path=word/numbering.xml><?xml version="1.0" encoding="utf-8"?>
+<w:numbering xmlns:wpc="http://schemas.microsoft.com/office/word/2010/wordprocessingCanvas" xmlns:cx="http://schemas.microsoft.com/office/drawing/2014/chartex" xmlns:cx1="http://schemas.microsoft.com/office/drawing/2015/9/8/chartex" xmlns:cx2="http://schemas.microsoft.com/office/drawing/2015/10/21/chartex" xmlns:cx3="http://schemas.microsoft.com/office/drawing/2016/5/9/chartex" xmlns:cx4="http://schemas.microsoft.com/office/drawing/2016/5/10/chartex" xmlns:cx5="http://schemas.microsoft.com/office/drawing/2016/5/11/chartex" xmlns:cx6="http://schemas.microsoft.com/office/drawing/2016/5/12/chartex" xmlns:cx7="http://schemas.microsoft.com/office/drawing/2016/5/13/chartex" xmlns:cx8="http://schemas.microsoft.com/office/drawing/2016/5/14/chartex" xmlns:mc="http://schemas.openxmlformats.org/markup-compatibility/2006" xmlns:aink="http://schemas.microsoft.com/office/drawing/2016/ink" xmlns:am3d="http://schemas.microsoft.com/office/drawing/2017/model3d" xmlns:o="urn:schemas-microsoft-com:office:office" xmlns:oel="http://schemas.microsoft.com/office/2019/extlst" xmlns:r="http://schemas.openxmlformats.org/officeDocument/2006/relationships" xmlns:m="http://schemas.openxmlformats.org/officeDocument/2006/math" xmlns:v="urn:schemas-microsoft-com:vml" xmlns:wp14="http://schemas.microsoft.com/office/word/2010/wordprocessingDrawing" xmlns:wp="http://schemas.openxmlformats.org/drawingml/2006/wordprocessingDrawing" xmlns:w10="urn:schemas-microsoft-com:office:word" xmlns:w="http://schemas.openxmlformats.org/wordprocessingml/2006/main" xmlns:w14="http://schemas.microsoft.com/office/word/2010/wordml" xmlns:w15="http://schemas.microsoft.com/office/word/2012/wordml" xmlns:w16cex="http://schemas.microsoft.com/office/word/2018/wordml/cex" xmlns:w16cid="http://schemas.microsoft.com/office/word/2016/wordml/cid" xmlns:w16="http://schemas.microsoft.com/office/word/2018/wordml" xmlns:w16du="http://schemas.microsoft.com/office/word/2023/wordml/word16du" xmlns:w16sdtdh="http://schemas.microsoft.com/office/word/2020/wordml/sdtdatahash" xmlns:w16sdtfl="http://schemas.microsoft.com/office/word/2024/wordml/sdtformatlock" xmlns:w16se="http://schemas.microsoft.com/office/word/2015/wordml/symex" xmlns:wpg="http://schemas.microsoft.com/office/word/2010/wordprocessingGroup" xmlns:wpi="http://schemas.microsoft.com/office/word/2010/wordprocessingInk" xmlns:wne="http://schemas.microsoft.com/office/word/2006/wordml" xmlns:wps="http://schemas.microsoft.com/office/word/2010/wordprocessingShape" mc:Ignorable="w14 w15 w16se w16cid w16 w16cex w16sdtdh w16sdtfl w16du wp14">
+  <w:abstractNum w:abstractNumId="0" w15:restartNumberingAfterBreak="0">
+    <w:nsid w:val="0D5D51C5"/>
+    <w:multiLevelType w:val="hybridMultilevel"/>
+    <w:tmpl w:val="87960C28"/>
+    <w:lvl w:ilvl="0" w:tplc="4009000B">
+      <w:start w:val="1"/>
+      <w:numFmt w:val="bullet"/>
+      <w:lvlText w:val=""/>
+      <w:lvlJc w:val="left"/>
+      <w:pPr>
+        <w:ind w:left="720" w:hanging="360"/>
+      </w:pPr>
+      <w:rPr>
+        <w:rFonts w:ascii="Wingdings" w:hAnsi="Wingdings" w:hint="default"/>
+      </w:rPr>
+    </w:lvl>
+    <w:lvl w:ilvl="1" w:tplc="40090003" w:tentative="1">
+      <w:start w:val="1"/>
+      <w:numFmt w:val="bullet"/>
+      <w:lvlText w:val="o"/>
+      <w:lvlJc w:val="left"/>
+      <w:pPr>
+        <w:ind w:left="1440" w:hanging="360"/>
+      </w:pPr>
+      <w:rPr>
+        <w:rFonts w:ascii="Courier New" w:hAnsi="Courier New" w:cs="Courier New" w:hint="default"/>
+      </w:rPr>
+    </w:lvl>
+    <w:lvl w:ilvl="2" w:tplc="40090005" w:tentative="1">
+      <w:start w:val="1"/>
+      <w:numFmt w:val="bullet"/>
+      <w:lvlText w:val=""/>
+      <w:lvlJc w:val="left"/>
+      <w:pPr>
+        <w:ind w:left="2160" w:hanging="360"/>
+      </w:pPr>
+      <w:rPr>
+        <w:rFonts w:ascii="Wingdings" w:hAnsi="Wingdings" w:hint="default"/>
+      </w:rPr>
+    </w:lvl>
+    <w:lvl w:ilvl="3" w:tplc="40090001" w:tentative="1">
+      <w:start w:val="1"/>
+      <w:numFmt w:val="bullet"/>
+      <w:lvlText w:val=""/>
+      <w:lvlJc w:val="left"/>
+      <w:pPr>
+        <w:ind w:left="2880" w:hanging="360"/>
+      </w:pPr>
+      <w:rPr>
+        <w:rFonts w:ascii="Symbol" w:hAnsi="Symbol" w:hint="default"/>
+      </w:rPr>
+    </w:lvl>
+    <w:lvl w:ilvl="4" w:tplc="40090003" w:tentative="1">
+      <w:start w:val="1"/>
+      <w:numFmt w:val="bullet"/>
+      <w:lvlText w:val="o"/>
+      <w:lvlJc w:val="left"/>
+      <w:pPr>
+        <w:ind w:left="3600" w:hanging="360"/>
+      </w:pPr>
+      <w:rPr>
+        <w:rFonts w:ascii="Courier New" w:hAnsi="Courier New" w:cs="Courier New" w:hint="default"/>
+      </w:rPr>
+    </w:lvl>
+    <w:lvl w:ilvl="5" w:tplc="40090005" w:tentative="1">
+      <w:start w:val="1"/>
+      <w:numFmt w:val="bullet"/>
+      <w:lvlText w:val=""/>
+      <w:lvlJc w:val="left"/>
+      <w:pPr>
+        <w:ind w:left="4320" w:hanging="360"/>
+      </w:pPr>
+      <w:rPr>
+        <w:rFonts w:ascii="Wingdings" w:hAnsi="Wingdings" w:hint="default"/>
+      </w:rPr>
+    </w:lvl>
+    <w:lvl w:ilvl="6" w:tplc="40090001" w:tentative="1">
+      <w:start w:val="1"/>
+      <w:numFmt w:val="bullet"/>
+      <w:lvlText w:val=""/>
+      <w:lvlJc w:val="left"/>
+      <w:pPr>
+        <w:ind w:left="5040" w:hanging="360"/>
+      </w:pPr>
+      <w:rPr>
+        <w:rFonts w:ascii="Symbol" w:hAnsi="Symbol" w:hint="default"/>
+      </w:rPr>
+    </w:lvl>
+    <w:lvl w:ilvl="7" w:tplc="40090003" w:tentative="1">
+      <w:start w:val="1"/>
+      <w:numFmt w:val="bullet"/>
+      <w:lvlText w:val="o"/>
+      <w:lvlJc w:val="left"/>
+      <w:pPr>
+        <w:ind w:left="5760" w:hanging="360"/>
+      </w:pPr>
+      <w:rPr>
+        <w:rFonts w:ascii="Courier New" w:hAnsi="Courier New" w:cs="Courier New" w:hint="default"/>
+      </w:rPr>
+    </w:lvl>
+    <w:lvl w:ilvl="8" w:tplc="40090005" w:tentative="1">
+      <w:start w:val="1"/>
+      <w:numFmt w:val="bullet"/>
+      <w:lvlText w:val=""/>
+      <w:lvlJc w:val="left"/>
+      <w:pPr>
+        <w:ind w:left="6480" w:hanging="360"/>
+      </w:pPr>
+      <w:rPr>
+        <w:rFonts w:ascii="Wingdings" w:hAnsi="Wingdings" w:hint="default"/>
+      </w:rPr>
+    </w:lvl>
+  </w:abstractNum>
+  <w:abstractNum w:abstractNumId="1" w15:restartNumberingAfterBreak="0">
+    <w:nsid w:val="499F2A61"/>
+    <w:multiLevelType w:val="hybridMultilevel"/>
+    <w:tmpl w:val="377A8D62"/>
+    <w:lvl w:ilvl="0" w:tplc="4009000F">
+      <w:start w:val="1"/>
+      <w:numFmt w:val="decimal"/>
+      <w:lvlText w:val="%1."/>
+      <w:lvlJc w:val="left"/>
+      <w:pPr>
+        <w:ind w:left="720" w:hanging="360"/>
+      </w:pPr>
+      <w:rPr>
+        <w:rFonts w:hint="default"/>
+      </w:rPr>
+    </w:lvl>
+    <w:lvl w:ilvl="1" w:tplc="40090019" w:tentative="1">
+      <w:start w:val="1"/>
+      <w:numFmt w:val="lowerLetter"/>
+      <w:lvlText w:val="%2."/>
+      <w:lvlJc w:val="left"/>
+      <w:pPr>
+        <w:ind w:left="1440" w:hanging="360"/>
+      </w:pPr>
+    </w:lvl>
+    <w:lvl w:ilvl="2" w:tplc="4009001B" w:tentative="1">
+      <w:start w:val="1"/>
+      <w:numFmt w:val="lowerRoman"/>
+      <w:lvlText w:val="%3."/>
+      <w:lvlJc w:val="right"/>
+      <w:pPr>
+        <w:ind w:left="2160" w:hanging="180"/>
+      </w:pPr>
+    </w:lvl>
+    <w:lvl w:ilvl="3" w:tplc="4009000F" w:tentative="1">
+      <w:start w:val="1"/>
+      <w:numFmt w:val="decimal"/>
+      <w:lvlText w:val="%4."/>
+      <w:lvlJc w:val="left"/>
+      <w:pPr>
+        <w:ind w:left="2880" w:hanging="360"/>
+      </w:pPr>
+    </w:lvl>
+    <w:lvl w:ilvl="4" w:tplc="40090019" w:tentative="1">
+      <w:start w:val="1"/>
+      <w:numFmt w:val="lowerLetter"/>
+      <w:lvlText w:val="%5."/>
+      <w:lvlJc w:val="left"/>
+      <w:pPr>
+        <w:ind w:left="3600" w:hanging="360"/>
+      </w:pPr>
+    </w:lvl>
+    <w:lvl w:ilvl="5" w:tplc="4009001B" w:tentative="1">
+      <w:start w:val="1"/>
+      <w:numFmt w:val="lowerRoman"/>
+      <w:lvlText w:val="%6."/>
+      <w:lvlJc w:val="right"/>
+      <w:pPr>
+        <w:ind w:left="4320" w:hanging="180"/>
+      </w:pPr>
+    </w:lvl>
+    <w:lvl w:ilvl="6" w:tplc="4009000F" w:tentative="1">
+      <w:start w:val="1"/>
+      <w:numFmt w:val="decimal"/>
+      <w:lvlText w:val="%7."/>
+      <w:lvlJc w:val="left"/>
+      <w:pPr>
+        <w:ind w:left="5040" w:hanging="360"/>
+      </w:pPr>
+    </w:lvl>
+    <w:lvl w:ilvl="7" w:tplc="40090019" w:tentative="1">
+      <w:start w:val="1"/>
+      <w:numFmt w:val="lowerLetter"/>
+      <w:lvlText w:val="%8."/>
+      <w:lvlJc w:val="left"/>
+      <w:pPr>
+        <w:ind w:left="5760" w:hanging="360"/>
+      </w:pPr>
+    </w:lvl>
+    <w:lvl w:ilvl="8" w:tplc="4009001B" w:tentative="1">
+      <w:start w:val="1"/>
+      <w:numFmt w:val="lowerRoman"/>
+      <w:lvlText w:val="%9."/>
+      <w:lvlJc w:val="right"/>
+      <w:pPr>
+        <w:ind w:left="6480" w:hanging="180"/>
+      </w:pPr>
+    </w:lvl>
+  </w:abstractNum>
+  <w:num w:numId="1" w16cid:durableId="1314601383">
+    <w:abstractNumId w:val="0"/>
+  </w:num>
+  <w:num w:numId="2" w16cid:durableId="470175112">
+    <w:abstractNumId w:val="1"/>
+  </w:num>
+</w:numbering>
 </file>
 
 <file path=word/styles.xml><?xml version="1.0" encoding="utf-8"?>

</xml_diff>